<commit_message>
Fix findings.docx links to point at the git repos
Path/filename references that used to be plain monospace text (local
analysis_temp paths, definity-app backend paths) are now clickable
hyperlinks to the actual GitHub locations: definity-app for production
code, this repo's TestGenerationModel/ for the investigation scripts
and report. Also fixed the Reproducibility intro, which incorrectly
claimed per-series CSVs are committed here (they are not).

Co-Authored-By: Claude Sonnet 5 <noreply@anthropic.com>
</commit_message>
<xml_diff>
--- a/TestGenerationModel/findings.docx
+++ b/TestGenerationModel/findings.docx
@@ -161,15 +161,18 @@
         </w:rPr>
         <w:t xml:space="preserve">The current test generation pipeline (</w:t>
       </w:r>
-      <w:r>
-        <w:rPr>
-          <w:rFonts w:ascii="Consolas" w:cs="Consolas" w:eastAsia="Consolas" w:hAnsi="Consolas"/>
-          <w:color w:val="0F4C81"/>
-          <w:sz w:val="20"/>
-          <w:szCs w:val="20"/>
-        </w:rPr>
-        <w:t xml:space="preserve">backend/app/brain/anomaly/tests_generator.py</w:t>
-      </w:r>
+      <w:hyperlink w:history="1" r:id="rId59q6ubeochsiiaxdtk-4s">
+        <w:r>
+          <w:rPr>
+            <w:rFonts w:ascii="Consolas" w:cs="Consolas" w:eastAsia="Consolas" w:hAnsi="Consolas"/>
+            <w:color w:val="1A56DB"/>
+            <w:sz w:val="20"/>
+            <w:szCs w:val="20"/>
+            <w:u w:val="single"/>
+          </w:rPr>
+          <w:t xml:space="preserve">backend/app/brain/anomaly/tests_generator.py</w:t>
+        </w:r>
+      </w:hyperlink>
       <w:r>
         <w:rPr>
           <w:rFonts w:ascii="Calibri" w:cs="Calibri" w:eastAsia="Calibri" w:hAnsi="Calibri"/>
@@ -179,15 +182,18 @@
         </w:rPr>
         <w:t xml:space="preserve"> plus </w:t>
       </w:r>
-      <w:r>
-        <w:rPr>
-          <w:rFonts w:ascii="Consolas" w:cs="Consolas" w:eastAsia="Consolas" w:hAnsi="Consolas"/>
-          <w:color w:val="0F4C81"/>
-          <w:sz w:val="20"/>
-          <w:szCs w:val="20"/>
-        </w:rPr>
-        <w:t xml:space="preserve">backend/app/tests_gen/</w:t>
-      </w:r>
+      <w:hyperlink w:history="1" r:id="rId6f4o1al_fmqquymnn0cg7">
+        <w:r>
+          <w:rPr>
+            <w:rFonts w:ascii="Consolas" w:cs="Consolas" w:eastAsia="Consolas" w:hAnsi="Consolas"/>
+            <w:color w:val="1A56DB"/>
+            <w:sz w:val="20"/>
+            <w:szCs w:val="20"/>
+            <w:u w:val="single"/>
+          </w:rPr>
+          <w:t xml:space="preserve">backend/app/tests_gen/</w:t>
+        </w:r>
+      </w:hyperlink>
       <w:r>
         <w:rPr>
           <w:rFonts w:ascii="Calibri" w:cs="Calibri" w:eastAsia="Calibri" w:hAnsi="Calibri"/>
@@ -472,15 +478,18 @@
         </w:rPr>
         <w:t xml:space="preserve"> (see </w:t>
       </w:r>
-      <w:r>
-        <w:rPr>
-          <w:rFonts w:ascii="Consolas" w:cs="Consolas" w:eastAsia="Consolas" w:hAnsi="Consolas"/>
-          <w:color w:val="0F4C81"/>
-          <w:sz w:val="20"/>
-          <w:szCs w:val="20"/>
-        </w:rPr>
-        <w:t xml:space="preserve">analysis_temp/seasonality-check/db/</w:t>
-      </w:r>
+      <w:hyperlink w:history="1" r:id="rIdiny2joqqt9jujcrhr1d4z">
+        <w:r>
+          <w:rPr>
+            <w:rFonts w:ascii="Consolas" w:cs="Consolas" w:eastAsia="Consolas" w:hAnsi="Consolas"/>
+            <w:color w:val="1A56DB"/>
+            <w:sz w:val="20"/>
+            <w:szCs w:val="20"/>
+            <w:u w:val="single"/>
+          </w:rPr>
+          <w:t xml:space="preserve">TestGenerationModel/db/</w:t>
+        </w:r>
+      </w:hyperlink>
       <w:r>
         <w:rPr>
           <w:rFonts w:ascii="Calibri" w:cs="Calibri" w:eastAsia="Calibri" w:hAnsi="Calibri"/>
@@ -1220,15 +1229,18 @@
         </w:rPr>
         <w:t xml:space="preserve"> than an hour-aware band would need, confirmed quantitatively via a backtest (</w:t>
       </w:r>
-      <w:r>
-        <w:rPr>
-          <w:rFonts w:ascii="Consolas" w:cs="Consolas" w:eastAsia="Consolas" w:hAnsi="Consolas"/>
-          <w:color w:val="0F4C81"/>
-          <w:sz w:val="20"/>
-          <w:szCs w:val="20"/>
-        </w:rPr>
-        <w:t xml:space="preserve">backtest_vs_existing_range.py</w:t>
-      </w:r>
+      <w:hyperlink w:history="1" r:id="rIdxvireaepibgrsd5uxnres">
+        <w:r>
+          <w:rPr>
+            <w:rFonts w:ascii="Consolas" w:cs="Consolas" w:eastAsia="Consolas" w:hAnsi="Consolas"/>
+            <w:color w:val="1A56DB"/>
+            <w:sz w:val="20"/>
+            <w:szCs w:val="20"/>
+            <w:u w:val="single"/>
+          </w:rPr>
+          <w:t xml:space="preserve">backtest_vs_existing_range.py</w:t>
+        </w:r>
+      </w:hyperlink>
       <w:r>
         <w:rPr>
           <w:rFonts w:ascii="Calibri" w:cs="Calibri" w:eastAsia="Calibri" w:hAnsi="Calibri"/>
@@ -1409,15 +1421,18 @@
         </w:rPr>
         <w:t xml:space="preserve"> (see </w:t>
       </w:r>
-      <w:r>
-        <w:rPr>
-          <w:rFonts w:ascii="Consolas" w:cs="Consolas" w:eastAsia="Consolas" w:hAnsi="Consolas"/>
-          <w:color w:val="0F4C81"/>
-          <w:sz w:val="20"/>
-          <w:szCs w:val="20"/>
-        </w:rPr>
-        <w:t xml:space="preserve">stage3_guarded_band.py</w:t>
-      </w:r>
+      <w:hyperlink w:history="1" r:id="rId2zq1pls7ltlfmr7-_9mly">
+        <w:r>
+          <w:rPr>
+            <w:rFonts w:ascii="Consolas" w:cs="Consolas" w:eastAsia="Consolas" w:hAnsi="Consolas"/>
+            <w:color w:val="1A56DB"/>
+            <w:sz w:val="20"/>
+            <w:szCs w:val="20"/>
+            <w:u w:val="single"/>
+          </w:rPr>
+          <w:t xml:space="preserve">stage3_guarded_band.py</w:t>
+        </w:r>
+      </w:hyperlink>
       <w:r>
         <w:rPr>
           <w:rFonts w:ascii="Calibri" w:cs="Calibri" w:eastAsia="Calibri" w:hAnsi="Calibri"/>
@@ -1427,15 +1442,18 @@
         </w:rPr>
         <w:t xml:space="preserve">, </w:t>
       </w:r>
-      <w:r>
-        <w:rPr>
-          <w:rFonts w:ascii="Consolas" w:cs="Consolas" w:eastAsia="Consolas" w:hAnsi="Consolas"/>
-          <w:color w:val="0F4C81"/>
-          <w:sz w:val="20"/>
-          <w:szCs w:val="20"/>
-        </w:rPr>
-        <w:t xml:space="preserve">stage4_final_eval.py</w:t>
-      </w:r>
+      <w:hyperlink w:history="1" r:id="rIdf3sxm981y4nqfqeojvnfr">
+        <w:r>
+          <w:rPr>
+            <w:rFonts w:ascii="Consolas" w:cs="Consolas" w:eastAsia="Consolas" w:hAnsi="Consolas"/>
+            <w:color w:val="1A56DB"/>
+            <w:sz w:val="20"/>
+            <w:szCs w:val="20"/>
+            <w:u w:val="single"/>
+          </w:rPr>
+          <w:t xml:space="preserve">stage4_final_eval.py</w:t>
+        </w:r>
+      </w:hyperlink>
       <w:r>
         <w:rPr>
           <w:rFonts w:ascii="Calibri" w:cs="Calibri" w:eastAsia="Calibri" w:hAnsi="Calibri"/>
@@ -3435,15 +3453,18 @@
         </w:rPr>
         <w:t xml:space="preserve"> (series exceeding a 5% false-alert rate), worse than simple adaptive baselines, and 250 KB-per-series model artifacts with no clear serving benefit over a stored-bounds table. See </w:t>
       </w:r>
-      <w:r>
-        <w:rPr>
-          <w:rFonts w:ascii="Consolas" w:cs="Consolas" w:eastAsia="Consolas" w:hAnsi="Consolas"/>
-          <w:color w:val="0F4C81"/>
-          <w:sz w:val="20"/>
-          <w:szCs w:val="20"/>
-        </w:rPr>
-        <w:t xml:space="preserve">model_bakeoff.py</w:t>
-      </w:r>
+      <w:hyperlink w:history="1" r:id="rIdd9dyeb49tly-ancovgyju">
+        <w:r>
+          <w:rPr>
+            <w:rFonts w:ascii="Consolas" w:cs="Consolas" w:eastAsia="Consolas" w:hAnsi="Consolas"/>
+            <w:color w:val="1A56DB"/>
+            <w:sz w:val="20"/>
+            <w:szCs w:val="20"/>
+            <w:u w:val="single"/>
+          </w:rPr>
+          <w:t xml:space="preserve">model_bakeoff.py</w:t>
+        </w:r>
+      </w:hyperlink>
       <w:r>
         <w:rPr>
           <w:rFonts w:ascii="Calibri" w:cs="Calibri" w:eastAsia="Calibri" w:hAnsi="Calibri"/>
@@ -5978,15 +5999,18 @@
         </w:rPr>
         <w:t xml:space="preserve">, more than 30x the 279-series sample behind Section 4.2, computed in small checkpointed chunks (</w:t>
       </w:r>
-      <w:r>
-        <w:rPr>
-          <w:rFonts w:ascii="Consolas" w:cs="Consolas" w:eastAsia="Consolas" w:hAnsi="Consolas"/>
-          <w:color w:val="0F4C81"/>
-          <w:sz w:val="20"/>
-          <w:szCs w:val="20"/>
-        </w:rPr>
-        <w:t xml:space="preserve">resilient_matrices.py</w:t>
-      </w:r>
+      <w:hyperlink w:history="1" r:id="rIdpovxhd-zp7etfombzbpiz">
+        <w:r>
+          <w:rPr>
+            <w:rFonts w:ascii="Consolas" w:cs="Consolas" w:eastAsia="Consolas" w:hAnsi="Consolas"/>
+            <w:color w:val="1A56DB"/>
+            <w:sz w:val="20"/>
+            <w:szCs w:val="20"/>
+            <w:u w:val="single"/>
+          </w:rPr>
+          <w:t xml:space="preserve">resilient_matrices.py</w:t>
+        </w:r>
+      </w:hyperlink>
       <w:r>
         <w:rPr>
           <w:rFonts w:ascii="Calibri" w:cs="Calibri" w:eastAsia="Calibri" w:hAnsi="Calibri"/>
@@ -6928,43 +6952,69 @@
           <w:sz w:val="22"/>
           <w:szCs w:val="22"/>
         </w:rPr>
-        <w:t xml:space="preserve">All scripts and per-series result files live in </w:t>
-      </w:r>
-      <w:r>
-        <w:rPr>
-          <w:rFonts w:ascii="Consolas" w:cs="Consolas" w:eastAsia="Consolas" w:hAnsi="Consolas"/>
-          <w:color w:val="0F4C81"/>
-          <w:sz w:val="20"/>
-          <w:szCs w:val="20"/>
-        </w:rPr>
-        <w:t xml:space="preserve">analysis_temp/seasonality-check/</w:t>
-      </w:r>
-      <w:r>
-        <w:rPr>
-          <w:rFonts w:ascii="Calibri" w:cs="Calibri" w:eastAsia="Calibri" w:hAnsi="Calibri"/>
-          <w:color w:val="1F2937"/>
-          <w:sz w:val="22"/>
-          <w:szCs w:val="22"/>
-        </w:rPr>
-        <w:t xml:space="preserve"> and </w:t>
-      </w:r>
-      <w:r>
-        <w:rPr>
-          <w:rFonts w:ascii="Consolas" w:cs="Consolas" w:eastAsia="Consolas" w:hAnsi="Consolas"/>
-          <w:color w:val="0F4C81"/>
-          <w:sz w:val="20"/>
-          <w:szCs w:val="20"/>
-        </w:rPr>
-        <w:t xml:space="preserve">analysis_temp/seasonality-check/db/</w:t>
-      </w:r>
-      <w:r>
-        <w:rPr>
-          <w:rFonts w:ascii="Calibri" w:cs="Calibri" w:eastAsia="Calibri" w:hAnsi="Calibri"/>
-          <w:color w:val="1F2937"/>
-          <w:sz w:val="22"/>
-          <w:szCs w:val="22"/>
-        </w:rPr>
-        <w:t xml:space="preserve">. Key scripts:</w:t>
+        <w:t xml:space="preserve">All scripts referenced below are pushed to </w:t>
+      </w:r>
+      <w:hyperlink w:history="1" r:id="rIdzvagjrsbfwqp2xg-6x6_e">
+        <w:r>
+          <w:rPr>
+            <w:rFonts w:ascii="Consolas" w:cs="Consolas" w:eastAsia="Consolas" w:hAnsi="Consolas"/>
+            <w:color w:val="1A56DB"/>
+            <w:sz w:val="20"/>
+            <w:szCs w:val="20"/>
+            <w:u w:val="single"/>
+          </w:rPr>
+          <w:t xml:space="preserve">github.com/rotem-pi/AI-projects/.../TestGenerationModel/</w:t>
+        </w:r>
+      </w:hyperlink>
+      <w:r>
+        <w:rPr>
+          <w:rFonts w:ascii="Calibri" w:cs="Calibri" w:eastAsia="Calibri" w:hAnsi="Calibri"/>
+          <w:color w:val="1F2937"/>
+          <w:sz w:val="22"/>
+          <w:szCs w:val="22"/>
+        </w:rPr>
+        <w:t xml:space="preserve">. Per-series result CSVs are </w:t>
+      </w:r>
+      <w:r>
+        <w:rPr>
+          <w:rFonts w:ascii="Calibri" w:cs="Calibri" w:eastAsia="Calibri" w:hAnsi="Calibri"/>
+          <w:i/>
+          <w:iCs/>
+          <w:color w:val="1F2937"/>
+          <w:sz w:val="22"/>
+          <w:szCs w:val="22"/>
+        </w:rPr>
+        <w:t xml:space="preserve">not</w:t>
+      </w:r>
+      <w:r>
+        <w:rPr>
+          <w:rFonts w:ascii="Calibri" w:cs="Calibri" w:eastAsia="Calibri" w:hAnsi="Calibri"/>
+          <w:color w:val="1F2937"/>
+          <w:sz w:val="22"/>
+          <w:szCs w:val="22"/>
+        </w:rPr>
+        <w:t xml:space="preserve"> committed (they are raw production pulls); rerun the relevant script against the replica to regenerate them - see the folder's own </w:t>
+      </w:r>
+      <w:hyperlink w:history="1" r:id="rIdllzxihzlkabxop_t8a9p4">
+        <w:r>
+          <w:rPr>
+            <w:rFonts w:ascii="Consolas" w:cs="Consolas" w:eastAsia="Consolas" w:hAnsi="Consolas"/>
+            <w:color w:val="1A56DB"/>
+            <w:sz w:val="20"/>
+            <w:szCs w:val="20"/>
+            <w:u w:val="single"/>
+          </w:rPr>
+          <w:t xml:space="preserve">README.md</w:t>
+        </w:r>
+      </w:hyperlink>
+      <w:r>
+        <w:rPr>
+          <w:rFonts w:ascii="Calibri" w:cs="Calibri" w:eastAsia="Calibri" w:hAnsi="Calibri"/>
+          <w:color w:val="1F2937"/>
+          <w:sz w:val="22"/>
+          <w:szCs w:val="22"/>
+        </w:rPr>
+        <w:t xml:space="preserve"> for setup. Key scripts:</w:t>
       </w:r>
     </w:p>
     <w:p>
@@ -6976,15 +7026,18 @@
         </w:numPr>
         <w:spacing w:after="90" w:line="276"/>
       </w:pPr>
-      <w:r>
-        <w:rPr>
-          <w:rFonts w:ascii="Consolas" w:cs="Consolas" w:eastAsia="Consolas" w:hAnsi="Consolas"/>
-          <w:color w:val="0F4C81"/>
-          <w:sz w:val="20"/>
-          <w:szCs w:val="20"/>
-        </w:rPr>
-        <w:t xml:space="preserve">model_bakeoff.py</w:t>
-      </w:r>
+      <w:hyperlink w:history="1" r:id="rIdpjaanveqn-eh7ayxrxn9u">
+        <w:r>
+          <w:rPr>
+            <w:rFonts w:ascii="Consolas" w:cs="Consolas" w:eastAsia="Consolas" w:hAnsi="Consolas"/>
+            <w:color w:val="1A56DB"/>
+            <w:sz w:val="20"/>
+            <w:szCs w:val="20"/>
+            <w:u w:val="single"/>
+          </w:rPr>
+          <w:t xml:space="preserve">model_bakeoff.py</w:t>
+        </w:r>
+      </w:hyperlink>
       <w:r>
         <w:rPr>
           <w:rFonts w:ascii="Calibri" w:cs="Calibri" w:eastAsia="Calibri" w:hAnsi="Calibri"/>
@@ -7004,15 +7057,39 @@
         </w:numPr>
         <w:spacing w:after="90" w:line="276"/>
       </w:pPr>
-      <w:r>
-        <w:rPr>
-          <w:rFonts w:ascii="Consolas" w:cs="Consolas" w:eastAsia="Consolas" w:hAnsi="Consolas"/>
-          <w:color w:val="0F4C81"/>
-          <w:sz w:val="20"/>
-          <w:szCs w:val="20"/>
-        </w:rPr>
-        <w:t xml:space="preserve">round2/3_*.py</w:t>
-      </w:r>
+      <w:hyperlink w:history="1" r:id="rIddhjjtnfmtro1keoh97mco">
+        <w:r>
+          <w:rPr>
+            <w:rFonts w:ascii="Consolas" w:cs="Consolas" w:eastAsia="Consolas" w:hAnsi="Consolas"/>
+            <w:color w:val="1A56DB"/>
+            <w:sz w:val="20"/>
+            <w:szCs w:val="20"/>
+            <w:u w:val="single"/>
+          </w:rPr>
+          <w:t xml:space="preserve">round2_representative.py</w:t>
+        </w:r>
+      </w:hyperlink>
+      <w:r>
+        <w:rPr>
+          <w:rFonts w:ascii="Calibri" w:cs="Calibri" w:eastAsia="Calibri" w:hAnsi="Calibri"/>
+          <w:color w:val="1F2937"/>
+          <w:sz w:val="22"/>
+          <w:szCs w:val="22"/>
+        </w:rPr>
+        <w:t xml:space="preserve"> / </w:t>
+      </w:r>
+      <w:hyperlink w:history="1" r:id="rIdnqkmc3kdebjjkh9qeddwc">
+        <w:r>
+          <w:rPr>
+            <w:rFonts w:ascii="Consolas" w:cs="Consolas" w:eastAsia="Consolas" w:hAnsi="Consolas"/>
+            <w:color w:val="1A56DB"/>
+            <w:sz w:val="20"/>
+            <w:szCs w:val="20"/>
+            <w:u w:val="single"/>
+          </w:rPr>
+          <w:t xml:space="preserve">round3_recent_tiers.py</w:t>
+        </w:r>
+      </w:hyperlink>
       <w:r>
         <w:rPr>
           <w:rFonts w:ascii="Calibri" w:cs="Calibri" w:eastAsia="Calibri" w:hAnsi="Calibri"/>
@@ -7032,15 +7109,18 @@
         </w:numPr>
         <w:spacing w:after="90" w:line="276"/>
       </w:pPr>
-      <w:r>
-        <w:rPr>
-          <w:rFonts w:ascii="Consolas" w:cs="Consolas" w:eastAsia="Consolas" w:hAnsi="Consolas"/>
-          <w:color w:val="0F4C81"/>
-          <w:sz w:val="20"/>
-          <w:szCs w:val="20"/>
-        </w:rPr>
-        <w:t xml:space="preserve">stage2_*.py</w:t>
-      </w:r>
+      <w:hyperlink w:history="1" r:id="rIdm-v199dm-kmawoxoigo7x">
+        <w:r>
+          <w:rPr>
+            <w:rFonts w:ascii="Consolas" w:cs="Consolas" w:eastAsia="Consolas" w:hAnsi="Consolas"/>
+            <w:color w:val="1A56DB"/>
+            <w:sz w:val="20"/>
+            <w:szCs w:val="20"/>
+            <w:u w:val="single"/>
+          </w:rPr>
+          <w:t xml:space="preserve">stage2_*.py</w:t>
+        </w:r>
+      </w:hyperlink>
       <w:r>
         <w:rPr>
           <w:rFonts w:ascii="Calibri" w:cs="Calibri" w:eastAsia="Calibri" w:hAnsi="Calibri"/>
@@ -7050,15 +7130,18 @@
         </w:rPr>
         <w:t xml:space="preserve">, </w:t>
       </w:r>
-      <w:r>
-        <w:rPr>
-          <w:rFonts w:ascii="Consolas" w:cs="Consolas" w:eastAsia="Consolas" w:hAnsi="Consolas"/>
-          <w:color w:val="0F4C81"/>
-          <w:sz w:val="20"/>
-          <w:szCs w:val="20"/>
-        </w:rPr>
-        <w:t xml:space="preserve">stage3_guarded_band.py</w:t>
-      </w:r>
+      <w:hyperlink w:history="1" r:id="rIdwqnvw_pnudmgnuavazw8s">
+        <w:r>
+          <w:rPr>
+            <w:rFonts w:ascii="Consolas" w:cs="Consolas" w:eastAsia="Consolas" w:hAnsi="Consolas"/>
+            <w:color w:val="1A56DB"/>
+            <w:sz w:val="20"/>
+            <w:szCs w:val="20"/>
+            <w:u w:val="single"/>
+          </w:rPr>
+          <w:t xml:space="preserve">stage3_guarded_band.py</w:t>
+        </w:r>
+      </w:hyperlink>
       <w:r>
         <w:rPr>
           <w:rFonts w:ascii="Calibri" w:cs="Calibri" w:eastAsia="Calibri" w:hAnsi="Calibri"/>
@@ -7068,15 +7151,18 @@
         </w:rPr>
         <w:t xml:space="preserve">, </w:t>
       </w:r>
-      <w:r>
-        <w:rPr>
-          <w:rFonts w:ascii="Consolas" w:cs="Consolas" w:eastAsia="Consolas" w:hAnsi="Consolas"/>
-          <w:color w:val="0F4C81"/>
-          <w:sz w:val="20"/>
-          <w:szCs w:val="20"/>
-        </w:rPr>
-        <w:t xml:space="preserve">stage4_final_eval.py</w:t>
-      </w:r>
+      <w:hyperlink w:history="1" r:id="rIdtxr39-dpejxsgf75_nc_n">
+        <w:r>
+          <w:rPr>
+            <w:rFonts w:ascii="Consolas" w:cs="Consolas" w:eastAsia="Consolas" w:hAnsi="Consolas"/>
+            <w:color w:val="1A56DB"/>
+            <w:sz w:val="20"/>
+            <w:szCs w:val="20"/>
+            <w:u w:val="single"/>
+          </w:rPr>
+          <w:t xml:space="preserve">stage4_final_eval.py</w:t>
+        </w:r>
+      </w:hyperlink>
       <w:r>
         <w:rPr>
           <w:rFonts w:ascii="Calibri" w:cs="Calibri" w:eastAsia="Calibri" w:hAnsi="Calibri"/>
@@ -7096,15 +7182,18 @@
         </w:numPr>
         <w:spacing w:after="90" w:line="276"/>
       </w:pPr>
-      <w:r>
-        <w:rPr>
-          <w:rFonts w:ascii="Consolas" w:cs="Consolas" w:eastAsia="Consolas" w:hAnsi="Consolas"/>
-          <w:color w:val="0F4C81"/>
-          <w:sz w:val="20"/>
-          <w:szCs w:val="20"/>
-        </w:rPr>
-        <w:t xml:space="preserve">stage5_conversion_matrices.py</w:t>
-      </w:r>
+      <w:hyperlink w:history="1" r:id="rIdmbmwuyvuh9fqoyp2slfbd">
+        <w:r>
+          <w:rPr>
+            <w:rFonts w:ascii="Consolas" w:cs="Consolas" w:eastAsia="Consolas" w:hAnsi="Consolas"/>
+            <w:color w:val="1A56DB"/>
+            <w:sz w:val="20"/>
+            <w:szCs w:val="20"/>
+            <w:u w:val="single"/>
+          </w:rPr>
+          <w:t xml:space="preserve">stage5_conversion_matrices.py</w:t>
+        </w:r>
+      </w:hyperlink>
       <w:r>
         <w:rPr>
           <w:rFonts w:ascii="Calibri" w:cs="Calibri" w:eastAsia="Calibri" w:hAnsi="Calibri"/>
@@ -7124,15 +7213,18 @@
         </w:numPr>
         <w:spacing w:after="90" w:line="276"/>
       </w:pPr>
-      <w:r>
-        <w:rPr>
-          <w:rFonts w:ascii="Consolas" w:cs="Consolas" w:eastAsia="Consolas" w:hAnsi="Consolas"/>
-          <w:color w:val="0F4C81"/>
-          <w:sz w:val="20"/>
-          <w:szCs w:val="20"/>
-        </w:rPr>
-        <w:t xml:space="preserve">resilient_matrices.py</w:t>
-      </w:r>
+      <w:hyperlink w:history="1" r:id="rIdvsoit69adbtvzey3-4jh4">
+        <w:r>
+          <w:rPr>
+            <w:rFonts w:ascii="Consolas" w:cs="Consolas" w:eastAsia="Consolas" w:hAnsi="Consolas"/>
+            <w:color w:val="1A56DB"/>
+            <w:sz w:val="20"/>
+            <w:szCs w:val="20"/>
+            <w:u w:val="single"/>
+          </w:rPr>
+          <w:t xml:space="preserve">resilient_matrices.py</w:t>
+        </w:r>
+      </w:hyperlink>
       <w:r>
         <w:rPr>
           <w:rFonts w:ascii="Calibri" w:cs="Calibri" w:eastAsia="Calibri" w:hAnsi="Calibri"/>
@@ -7142,15 +7234,18 @@
         </w:rPr>
         <w:t xml:space="preserve"> / </w:t>
       </w:r>
-      <w:r>
-        <w:rPr>
-          <w:rFonts w:ascii="Consolas" w:cs="Consolas" w:eastAsia="Consolas" w:hAnsi="Consolas"/>
-          <w:color w:val="0F4C81"/>
-          <w:sz w:val="20"/>
-          <w:szCs w:val="20"/>
-        </w:rPr>
-        <w:t xml:space="preserve">aggregate_resilient.py</w:t>
-      </w:r>
+      <w:hyperlink w:history="1" r:id="rId4vntzizyxtnvkzai56sto">
+        <w:r>
+          <w:rPr>
+            <w:rFonts w:ascii="Consolas" w:cs="Consolas" w:eastAsia="Consolas" w:hAnsi="Consolas"/>
+            <w:color w:val="1A56DB"/>
+            <w:sz w:val="20"/>
+            <w:szCs w:val="20"/>
+            <w:u w:val="single"/>
+          </w:rPr>
+          <w:t xml:space="preserve">aggregate_resilient.py</w:t>
+        </w:r>
+      </w:hyperlink>
       <w:r>
         <w:rPr>
           <w:rFonts w:ascii="Calibri" w:cs="Calibri" w:eastAsia="Calibri" w:hAnsi="Calibri"/>
@@ -7170,15 +7265,18 @@
         </w:numPr>
         <w:spacing w:after="90" w:line="276"/>
       </w:pPr>
-      <w:r>
-        <w:rPr>
-          <w:rFonts w:ascii="Consolas" w:cs="Consolas" w:eastAsia="Consolas" w:hAnsi="Consolas"/>
-          <w:color w:val="0F4C81"/>
-          <w:sz w:val="20"/>
-          <w:szCs w:val="20"/>
-        </w:rPr>
-        <w:t xml:space="preserve">visual_side_by_side.py</w:t>
-      </w:r>
+      <w:hyperlink w:history="1" r:id="rId0ateipr3j__kt2q-46vjd">
+        <w:r>
+          <w:rPr>
+            <w:rFonts w:ascii="Consolas" w:cs="Consolas" w:eastAsia="Consolas" w:hAnsi="Consolas"/>
+            <w:color w:val="1A56DB"/>
+            <w:sz w:val="20"/>
+            <w:szCs w:val="20"/>
+            <w:u w:val="single"/>
+          </w:rPr>
+          <w:t xml:space="preserve">visual_side_by_side.py</w:t>
+        </w:r>
+      </w:hyperlink>
       <w:r>
         <w:rPr>
           <w:rFonts w:ascii="Calibri" w:cs="Calibri" w:eastAsia="Calibri" w:hAnsi="Calibri"/>
@@ -7198,15 +7296,18 @@
         </w:numPr>
         <w:spacing w:after="90" w:line="276"/>
       </w:pPr>
-      <w:r>
-        <w:rPr>
-          <w:rFonts w:ascii="Consolas" w:cs="Consolas" w:eastAsia="Consolas" w:hAnsi="Consolas"/>
-          <w:color w:val="0F4C81"/>
-          <w:sz w:val="20"/>
-          <w:szCs w:val="20"/>
-        </w:rPr>
-        <w:t xml:space="preserve">stage4_final_eval.py</w:t>
-      </w:r>
+      <w:hyperlink w:history="1" r:id="rIdqcnd393frarhczajxnvlq">
+        <w:r>
+          <w:rPr>
+            <w:rFonts w:ascii="Consolas" w:cs="Consolas" w:eastAsia="Consolas" w:hAnsi="Consolas"/>
+            <w:color w:val="1A56DB"/>
+            <w:sz w:val="20"/>
+            <w:szCs w:val="20"/>
+            <w:u w:val="single"/>
+          </w:rPr>
+          <w:t xml:space="preserve">stage4_final_eval.py</w:t>
+        </w:r>
+      </w:hyperlink>
       <w:r>
         <w:rPr>
           <w:rFonts w:ascii="Calibri" w:cs="Calibri" w:eastAsia="Calibri" w:hAnsi="Calibri"/>
@@ -7216,15 +7317,18 @@
         </w:rPr>
         <w:t xml:space="preserve"> -&gt; </w:t>
       </w:r>
-      <w:r>
-        <w:rPr>
-          <w:rFonts w:ascii="Consolas" w:cs="Consolas" w:eastAsia="Consolas" w:hAnsi="Consolas"/>
-          <w:color w:val="0F4C81"/>
-          <w:sz w:val="20"/>
-          <w:szCs w:val="20"/>
-        </w:rPr>
-        <w:t xml:space="preserve">guarded_band_report.html</w:t>
-      </w:r>
+      <w:hyperlink w:history="1" r:id="rIdk4kuhkfa5rijgkbt4hlo5">
+        <w:r>
+          <w:rPr>
+            <w:rFonts w:ascii="Consolas" w:cs="Consolas" w:eastAsia="Consolas" w:hAnsi="Consolas"/>
+            <w:color w:val="1A56DB"/>
+            <w:sz w:val="20"/>
+            <w:szCs w:val="20"/>
+            <w:u w:val="single"/>
+          </w:rPr>
+          <w:t xml:space="preserve">guarded_band_report.html</w:t>
+        </w:r>
+      </w:hyperlink>
       <w:r>
         <w:rPr>
           <w:rFonts w:ascii="Calibri" w:cs="Calibri" w:eastAsia="Calibri" w:hAnsi="Calibri"/>

</xml_diff>